<commit_message>
Fix P2 template table layouts
</commit_message>
<xml_diff>
--- a/app/doc_templates/p2_standard_v1/M03_instrument_of_transfer_standard.docx
+++ b/app/doc_templates/p2_standard_v1/M03_instrument_of_transfer_standard.docx
@@ -157,17 +157,17 @@
         </w:tblCellMar>
       </w:tblPr>
       <w:tblGrid>
-        <w:gridCol w:w="1580"/>
-        <w:gridCol w:w="1580"/>
-        <w:gridCol w:w="1100"/>
-        <w:gridCol w:w="1160"/>
-        <w:gridCol w:w="1260"/>
-        <w:gridCol w:w="2680"/>
+        <w:gridCol w:w="1550"/>
+        <w:gridCol w:w="1550"/>
+        <w:gridCol w:w="900"/>
+        <w:gridCol w:w="1450"/>
+        <w:gridCol w:w="1450"/>
+        <w:gridCol w:w="2460"/>
       </w:tblGrid>
       <w:tr>
         <w:tc>
           <w:tcPr>
-            <w:tcW w:type="dxa" w:w="1580"/>
+            <w:tcW w:type="dxa" w:w="1550"/>
             <w:shd w:fill="F2F4F7"/>
             <w:vAlign w:val="center"/>
           </w:tcPr>
@@ -188,7 +188,7 @@
         </w:tc>
         <w:tc>
           <w:tcPr>
-            <w:tcW w:type="dxa" w:w="1580"/>
+            <w:tcW w:type="dxa" w:w="1550"/>
             <w:shd w:fill="F2F4F7"/>
             <w:vAlign w:val="center"/>
           </w:tcPr>
@@ -209,7 +209,7 @@
         </w:tc>
         <w:tc>
           <w:tcPr>
-            <w:tcW w:type="dxa" w:w="1100"/>
+            <w:tcW w:type="dxa" w:w="900"/>
             <w:shd w:fill="F2F4F7"/>
             <w:vAlign w:val="center"/>
           </w:tcPr>
@@ -230,7 +230,7 @@
         </w:tc>
         <w:tc>
           <w:tcPr>
-            <w:tcW w:type="dxa" w:w="1160"/>
+            <w:tcW w:type="dxa" w:w="1450"/>
             <w:shd w:fill="F2F4F7"/>
             <w:vAlign w:val="center"/>
           </w:tcPr>
@@ -251,7 +251,7 @@
         </w:tc>
         <w:tc>
           <w:tcPr>
-            <w:tcW w:type="dxa" w:w="1260"/>
+            <w:tcW w:type="dxa" w:w="1450"/>
             <w:shd w:fill="F2F4F7"/>
             <w:vAlign w:val="center"/>
           </w:tcPr>
@@ -272,7 +272,7 @@
         </w:tc>
         <w:tc>
           <w:tcPr>
-            <w:tcW w:type="dxa" w:w="2680"/>
+            <w:tcW w:type="dxa" w:w="2460"/>
             <w:shd w:fill="F2F4F7"/>
             <w:vAlign w:val="center"/>
           </w:tcPr>
@@ -295,7 +295,7 @@
       <w:tr>
         <w:tc>
           <w:tcPr>
-            <w:tcW w:type="dxa" w:w="1580"/>
+            <w:tcW w:type="dxa" w:w="1550"/>
             <w:vAlign w:val="center"/>
           </w:tcPr>
           <w:p>
@@ -314,7 +314,7 @@
         </w:tc>
         <w:tc>
           <w:tcPr>
-            <w:tcW w:type="dxa" w:w="1580"/>
+            <w:tcW w:type="dxa" w:w="1550"/>
             <w:vAlign w:val="center"/>
           </w:tcPr>
           <w:p>
@@ -333,12 +333,13 @@
         </w:tc>
         <w:tc>
           <w:tcPr>
-            <w:tcW w:type="dxa" w:w="1100"/>
+            <w:tcW w:type="dxa" w:w="900"/>
             <w:vAlign w:val="center"/>
           </w:tcPr>
           <w:p>
             <w:pPr>
               <w:spacing w:before="0" w:after="0"/>
+              <w:jc w:val="center"/>
             </w:pPr>
             <w:r>
               <w:rPr>
@@ -352,12 +353,13 @@
         </w:tc>
         <w:tc>
           <w:tcPr>
-            <w:tcW w:type="dxa" w:w="1160"/>
+            <w:tcW w:type="dxa" w:w="1450"/>
             <w:vAlign w:val="center"/>
           </w:tcPr>
           <w:p>
             <w:pPr>
               <w:spacing w:before="0" w:after="0"/>
+              <w:jc w:val="center"/>
             </w:pPr>
             <w:r>
               <w:rPr>
@@ -371,12 +373,13 @@
         </w:tc>
         <w:tc>
           <w:tcPr>
-            <w:tcW w:type="dxa" w:w="1260"/>
+            <w:tcW w:type="dxa" w:w="1450"/>
             <w:vAlign w:val="center"/>
           </w:tcPr>
           <w:p>
             <w:pPr>
               <w:spacing w:before="0" w:after="0"/>
+              <w:jc w:val="center"/>
             </w:pPr>
             <w:r>
               <w:rPr>
@@ -390,7 +393,7 @@
         </w:tc>
         <w:tc>
           <w:tcPr>
-            <w:tcW w:type="dxa" w:w="2680"/>
+            <w:tcW w:type="dxa" w:w="2460"/>
             <w:vAlign w:val="center"/>
           </w:tcPr>
           <w:p>

</xml_diff>